<commit_message>
Add type (public/private) column to the collection table
Adds a required type field to Collection, constrained to 'public' or
'private' (defaults to 'private'), controlling whether a collection is
visible in the public catalog.

- schema.sql: new column with a check constraint, plus a supporting index
- schema.prisma: matching field
- Design Document (.md and .docx): entity summary, Section 2.4 narrative,
  all three ER diagrams (inline, Appendix intro, and A.1 Collection),
  and the A.1 data dictionary table
- Business Requirements Document (.docx): Collection description
- full-erd.png: regenerated from the updated Mermaid source to show
  the new field

Also fixes a pre-existing OPC content-type declaration bug in the
Design Document .docx (an embedded image had an undeclared file
extension, making it unopenable by strict OOXML readers).

Co-Authored-By: Claude Sonnet 5 <noreply@anthropic.com>
Claude-Session: https://claude.ai/code/session_01EmJ2gcyX3y34v9xsvoH49j
</commit_message>
<xml_diff>
--- a/Artium-Gallery_Design_Document.docx
+++ b/Artium-Gallery_Design_Document.docx
@@ -320,6 +320,9 @@
               </w:rPr>
               <w:t xml:space="preserve">An optional named grouping (e.g. a specific exhibit, donor collection, or curatorial sub-collection) that Artifact, Artist, School, Period, or Country records may optionally belong to.</w:t>
             </w:r>
+            <w:r>
+              <w:t xml:space="preserve"> Marked public or private to control catalog visibility.</w:t>
+            </w:r>
           </w:p>
         </w:tc>
       </w:tr>
@@ -1658,6 +1661,20 @@
                 <w:sz w:val="17"/>
                 <w:szCs w:val="17"/>
               </w:rPr>
+              <w:t xml:space="preserve">    string type "public or private"</w:t>
+            </w:r>
+          </w:p>
+          <w:p>
+            <w:pPr>
+              <w:spacing w:after="0"/>
+            </w:pPr>
+            <w:r>
+              <w:rPr>
+                <w:rFonts w:ascii="Consolas" w:cs="Consolas" w:eastAsia="Consolas" w:hAnsi="Consolas"/>
+                <w:color w:val="3D3D3A"/>
+                <w:sz w:val="17"/>
+                <w:szCs w:val="17"/>
+              </w:rPr>
               <w:t xml:space="preserve">    string created_by_name "full name, not a User FK"</w:t>
             </w:r>
           </w:p>
@@ -2736,7 +2753,7 @@
         <w:t xml:space="preserve">collection_name</w:t>
       </w:r>
       <w:r>
-        <w:t xml:space="preserve">, plus audit fields </w:t>
+        <w:t xml:space="preserve">, type (public or private), plus audit fields </w:t>
       </w:r>
       <w:r>
         <w:rPr>
@@ -2937,6 +2954,25 @@
       </w:r>
       <w:r>
         <w:t xml:space="preserve"> until the Collection is edited for the first time, at which point they're set and updated on every subsequent edit.</w:t>
+      </w:r>
+    </w:p>
+    <w:p>
+      <w:pPr>
+        <w:pStyle w:val="ListParagraph"/>
+        <w:numPr>
+          <w:ilvl w:val="0"/>
+          <w:numId w:val="2"/>
+        </w:numPr>
+        <w:spacing w:after="80"/>
+      </w:pPr>
+      <w:r>
+        <w:rPr>
+          <w:rFonts w:ascii="Consolas" w:cs="Consolas" w:eastAsia="Consolas" w:hAnsi="Consolas"/>
+          <w:color w:val="A6501F"/>
+          <w:sz w:val="19"/>
+          <w:szCs w:val="19"/>
+        </w:rPr>
+        <w:t xml:space="preserve">type is required and constrained to exactly two values: public (visible in the Vercel-hosted catalog and to anonymous visitors) or private (staff-only, used for in-progress exhibits, internal groupings, or donor collections not yet ready to publish). Defaults to private so a newly created Collection isn't exposed before a curator explicitly marks it public.</w:t>
       </w:r>
     </w:p>
     <w:p>
@@ -14599,6 +14635,20 @@
                 <w:sz w:val="17"/>
                 <w:szCs w:val="17"/>
               </w:rPr>
+              <w:t xml:space="preserve">    string type "public or private"</w:t>
+            </w:r>
+          </w:p>
+          <w:p>
+            <w:pPr>
+              <w:spacing w:after="0"/>
+            </w:pPr>
+            <w:r>
+              <w:rPr>
+                <w:rFonts w:ascii="Consolas" w:cs="Consolas" w:eastAsia="Consolas" w:hAnsi="Consolas"/>
+                <w:color w:val="3D3D3A"/>
+                <w:sz w:val="17"/>
+                <w:szCs w:val="17"/>
+              </w:rPr>
               <w:t xml:space="preserve">    string created_by_name "full name, not a User FK"</w:t>
             </w:r>
           </w:p>
@@ -15797,6 +15847,20 @@
                 <w:szCs w:val="17"/>
               </w:rPr>
               <w:t xml:space="preserve">    string collection_name</w:t>
+            </w:r>
+          </w:p>
+          <w:p>
+            <w:pPr>
+              <w:spacing w:after="0"/>
+            </w:pPr>
+            <w:r>
+              <w:rPr>
+                <w:rFonts w:ascii="Consolas" w:cs="Consolas" w:eastAsia="Consolas" w:hAnsi="Consolas"/>
+                <w:color w:val="3D3D3A"/>
+                <w:sz w:val="17"/>
+                <w:szCs w:val="17"/>
+              </w:rPr>
+              <w:t xml:space="preserve">    string type "public or private"</w:t>
             </w:r>
           </w:p>
           <w:p>
@@ -16296,6 +16360,140 @@
                 <w:szCs w:val="19"/>
               </w:rPr>
               <w:t xml:space="preserve">Name of the collection/exhibit/grouping</w:t>
+            </w:r>
+          </w:p>
+        </w:tc>
+      </w:tr>
+      <w:tr>
+        <w:tc>
+          <w:tcPr>
+            <w:tcW w:type="dxa" w:w="2340"/>
+            <w:tcBorders>
+              <w:top w:val="single" w:color="CCCCCC" w:sz="1"/>
+              <w:left w:val="single" w:color="CCCCCC" w:sz="1"/>
+              <w:bottom w:val="single" w:color="CCCCCC" w:sz="1"/>
+              <w:right w:val="single" w:color="CCCCCC" w:sz="1"/>
+            </w:tcBorders>
+            <w:shd w:fill="F7F6F2" w:val="clear"/>
+            <w:tcMar>
+              <w:top w:type="dxa" w:w="90"/>
+              <w:left w:type="dxa" w:w="110"/>
+              <w:bottom w:type="dxa" w:w="90"/>
+              <w:right w:type="dxa" w:w="110"/>
+            </w:tcMar>
+            <w:vAlign w:val="center"/>
+          </w:tcPr>
+          <w:p>
+            <w:pPr>
+              <w:jc w:val="left"/>
+            </w:pPr>
+            <w:r>
+              <w:rPr>
+                <w:b w:val="false"/>
+                <w:bCs w:val="false"/>
+                <w:sz w:val="19"/>
+                <w:szCs w:val="19"/>
+              </w:rPr>
+              <w:t xml:space="preserve">type</w:t>
+            </w:r>
+          </w:p>
+        </w:tc>
+        <w:tc>
+          <w:tcPr>
+            <w:tcW w:type="dxa" w:w="2340"/>
+            <w:tcBorders>
+              <w:top w:val="single" w:color="CCCCCC" w:sz="1"/>
+              <w:left w:val="single" w:color="CCCCCC" w:sz="1"/>
+              <w:bottom w:val="single" w:color="CCCCCC" w:sz="1"/>
+              <w:right w:val="single" w:color="CCCCCC" w:sz="1"/>
+            </w:tcBorders>
+            <w:shd w:fill="F7F6F2" w:val="clear"/>
+            <w:tcMar>
+              <w:top w:type="dxa" w:w="90"/>
+              <w:left w:type="dxa" w:w="110"/>
+              <w:bottom w:type="dxa" w:w="90"/>
+              <w:right w:type="dxa" w:w="110"/>
+            </w:tcMar>
+            <w:vAlign w:val="center"/>
+          </w:tcPr>
+          <w:p>
+            <w:pPr>
+              <w:jc w:val="left"/>
+            </w:pPr>
+            <w:r>
+              <w:rPr>
+                <w:b w:val="false"/>
+                <w:bCs w:val="false"/>
+                <w:sz w:val="19"/>
+                <w:szCs w:val="19"/>
+              </w:rPr>
+              <w:t xml:space="preserve">String</w:t>
+            </w:r>
+          </w:p>
+        </w:tc>
+        <w:tc>
+          <w:tcPr>
+            <w:tcW w:type="dxa" w:w="2340"/>
+            <w:tcBorders>
+              <w:top w:val="single" w:color="CCCCCC" w:sz="1"/>
+              <w:left w:val="single" w:color="CCCCCC" w:sz="1"/>
+              <w:bottom w:val="single" w:color="CCCCCC" w:sz="1"/>
+              <w:right w:val="single" w:color="CCCCCC" w:sz="1"/>
+            </w:tcBorders>
+            <w:shd w:fill="F7F6F2" w:val="clear"/>
+            <w:tcMar>
+              <w:top w:type="dxa" w:w="90"/>
+              <w:left w:type="dxa" w:w="110"/>
+              <w:bottom w:type="dxa" w:w="90"/>
+              <w:right w:type="dxa" w:w="110"/>
+            </w:tcMar>
+            <w:vAlign w:val="center"/>
+          </w:tcPr>
+          <w:p>
+            <w:pPr>
+              <w:jc w:val="left"/>
+            </w:pPr>
+            <w:r>
+              <w:rPr>
+                <w:b w:val="false"/>
+                <w:bCs w:val="false"/>
+                <w:sz w:val="19"/>
+                <w:szCs w:val="19"/>
+              </w:rPr>
+              <w:t xml:space="preserve">No</w:t>
+            </w:r>
+          </w:p>
+        </w:tc>
+        <w:tc>
+          <w:tcPr>
+            <w:tcW w:type="dxa" w:w="2340"/>
+            <w:tcBorders>
+              <w:top w:val="single" w:color="CCCCCC" w:sz="1"/>
+              <w:left w:val="single" w:color="CCCCCC" w:sz="1"/>
+              <w:bottom w:val="single" w:color="CCCCCC" w:sz="1"/>
+              <w:right w:val="single" w:color="CCCCCC" w:sz="1"/>
+            </w:tcBorders>
+            <w:shd w:fill="F7F6F2" w:val="clear"/>
+            <w:tcMar>
+              <w:top w:type="dxa" w:w="90"/>
+              <w:left w:type="dxa" w:w="110"/>
+              <w:bottom w:type="dxa" w:w="90"/>
+              <w:right w:type="dxa" w:w="110"/>
+            </w:tcMar>
+            <w:vAlign w:val="center"/>
+          </w:tcPr>
+          <w:p>
+            <w:pPr>
+              <w:jc w:val="left"/>
+            </w:pPr>
+            <w:r>
+              <w:rPr>
+                <w:b w:val="false"/>
+                <w:bCs w:val="false"/>
+                <w:sz w:val="19"/>
+                <w:szCs w:val="19"/>
+              </w:rPr>
+              <w:t xml:space="preserve">public or private — controls whether the collection is visible in the public catalog</w:t>
             </w:r>
           </w:p>
         </w:tc>

</xml_diff>

<commit_message>
Restrict Organization create/edit to Admin and Curator only
Contributors can no longer create or edit Organization (museum)
records. Updates the commented resolver sketch's @Roles guard from
admin-only to admin + curator, and documents the rule in the Design
Document (Section 2.4.1 narrative, Section 3.2 permission matrix,
.md + .docx). Also notes explicitly that Create/Edit is a single form
for both actions, not separate screens, matching MuseumForm.tsx.

Co-Authored-By: Claude Sonnet 5 <noreply@anthropic.com>
Claude-Session: https://claude.ai/code/session_01EmJ2gcyX3y34v9xsvoH49j
</commit_message>
<xml_diff>
--- a/Artium-Gallery_Design_Document.docx
+++ b/Artium-Gallery_Design_Document.docx
@@ -3769,6 +3769,14 @@
       </w:pPr>
       <w:r>
         <w:t xml:space="preserve">A single-museum deployment simply has one Organization row; the model is ready for a multi-museum deployment (e.g. a shared platform hosting several institutions' catalogs) without further schema changes.</w:t>
+      </w:r>
+    </w:p>
+    <w:p>
+      <w:pPr>
+        <w:spacing w:after="160"/>
+      </w:pPr>
+      <w:r>
+        <w:t xml:space="preserve">Only Admin and Curator roles may create or edit an Organization record — Contributors cannot (see Section 3.2's permission matrix). A single Create/Edit form is used for both actions; created_at/updated_at are never exposed as editable fields on it regardless of role.</w:t>
       </w:r>
     </w:p>
     <w:p>
@@ -6904,6 +6912,168 @@
                 <w:szCs w:val="19"/>
               </w:rPr>
               <w:t xml:space="preserve">✅ (for Collections they themselves have manage on)</w:t>
+            </w:r>
+          </w:p>
+        </w:tc>
+        <w:tc>
+          <w:tcPr>
+            <w:tcW w:type="dxa" w:w="1872"/>
+            <w:tcBorders>
+              <w:top w:val="single" w:color="CCCCCC" w:sz="1"/>
+              <w:left w:val="single" w:color="CCCCCC" w:sz="1"/>
+              <w:bottom w:val="single" w:color="CCCCCC" w:sz="1"/>
+              <w:right w:val="single" w:color="CCCCCC" w:sz="1"/>
+            </w:tcBorders>
+            <w:tcMar>
+              <w:top w:type="dxa" w:w="90"/>
+              <w:left w:type="dxa" w:w="110"/>
+              <w:bottom w:type="dxa" w:w="90"/>
+              <w:right w:type="dxa" w:w="110"/>
+            </w:tcMar>
+            <w:vAlign w:val="center"/>
+          </w:tcPr>
+          <w:p>
+            <w:pPr>
+              <w:jc w:val="left"/>
+            </w:pPr>
+            <w:r>
+              <w:rPr>
+                <w:b w:val="false"/>
+                <w:bCs w:val="false"/>
+                <w:sz w:val="19"/>
+                <w:szCs w:val="19"/>
+              </w:rPr>
+              <w:t xml:space="preserve">❌</w:t>
+            </w:r>
+          </w:p>
+        </w:tc>
+        <w:tc>
+          <w:tcPr>
+            <w:tcW w:type="dxa" w:w="1872"/>
+            <w:tcBorders>
+              <w:top w:val="single" w:color="CCCCCC" w:sz="1"/>
+              <w:left w:val="single" w:color="CCCCCC" w:sz="1"/>
+              <w:bottom w:val="single" w:color="CCCCCC" w:sz="1"/>
+              <w:right w:val="single" w:color="CCCCCC" w:sz="1"/>
+            </w:tcBorders>
+            <w:tcMar>
+              <w:top w:type="dxa" w:w="90"/>
+              <w:left w:type="dxa" w:w="110"/>
+              <w:bottom w:type="dxa" w:w="90"/>
+              <w:right w:type="dxa" w:w="110"/>
+            </w:tcMar>
+            <w:vAlign w:val="center"/>
+          </w:tcPr>
+          <w:p>
+            <w:pPr>
+              <w:jc w:val="left"/>
+            </w:pPr>
+            <w:r>
+              <w:rPr>
+                <w:b w:val="false"/>
+                <w:bCs w:val="false"/>
+                <w:sz w:val="19"/>
+                <w:szCs w:val="19"/>
+              </w:rPr>
+              <w:t xml:space="preserve">❌</w:t>
+            </w:r>
+          </w:p>
+        </w:tc>
+      </w:tr>
+      <w:tr>
+        <w:tc>
+          <w:tcPr>
+            <w:tcW w:type="dxa" w:w="1872"/>
+            <w:tcBorders>
+              <w:top w:val="single" w:color="CCCCCC" w:sz="1"/>
+              <w:left w:val="single" w:color="CCCCCC" w:sz="1"/>
+              <w:bottom w:val="single" w:color="CCCCCC" w:sz="1"/>
+              <w:right w:val="single" w:color="CCCCCC" w:sz="1"/>
+            </w:tcBorders>
+            <w:tcMar>
+              <w:top w:type="dxa" w:w="90"/>
+              <w:left w:type="dxa" w:w="110"/>
+              <w:bottom w:type="dxa" w:w="90"/>
+              <w:right w:type="dxa" w:w="110"/>
+            </w:tcMar>
+            <w:vAlign w:val="center"/>
+          </w:tcPr>
+          <w:p>
+            <w:pPr>
+              <w:jc w:val="left"/>
+            </w:pPr>
+            <w:r>
+              <w:rPr>
+                <w:b w:val="false"/>
+                <w:bCs w:val="false"/>
+                <w:sz w:val="19"/>
+                <w:szCs w:val="19"/>
+              </w:rPr>
+              <w:t xml:space="preserve">Create/edit Organization (museum) records</w:t>
+            </w:r>
+          </w:p>
+        </w:tc>
+        <w:tc>
+          <w:tcPr>
+            <w:tcW w:type="dxa" w:w="1872"/>
+            <w:tcBorders>
+              <w:top w:val="single" w:color="CCCCCC" w:sz="1"/>
+              <w:left w:val="single" w:color="CCCCCC" w:sz="1"/>
+              <w:bottom w:val="single" w:color="CCCCCC" w:sz="1"/>
+              <w:right w:val="single" w:color="CCCCCC" w:sz="1"/>
+            </w:tcBorders>
+            <w:tcMar>
+              <w:top w:type="dxa" w:w="90"/>
+              <w:left w:type="dxa" w:w="110"/>
+              <w:bottom w:type="dxa" w:w="90"/>
+              <w:right w:type="dxa" w:w="110"/>
+            </w:tcMar>
+            <w:vAlign w:val="center"/>
+          </w:tcPr>
+          <w:p>
+            <w:pPr>
+              <w:jc w:val="left"/>
+            </w:pPr>
+            <w:r>
+              <w:rPr>
+                <w:b w:val="false"/>
+                <w:bCs w:val="false"/>
+                <w:sz w:val="19"/>
+                <w:szCs w:val="19"/>
+              </w:rPr>
+              <w:t xml:space="preserve">✅</w:t>
+            </w:r>
+          </w:p>
+        </w:tc>
+        <w:tc>
+          <w:tcPr>
+            <w:tcW w:type="dxa" w:w="1872"/>
+            <w:tcBorders>
+              <w:top w:val="single" w:color="CCCCCC" w:sz="1"/>
+              <w:left w:val="single" w:color="CCCCCC" w:sz="1"/>
+              <w:bottom w:val="single" w:color="CCCCCC" w:sz="1"/>
+              <w:right w:val="single" w:color="CCCCCC" w:sz="1"/>
+            </w:tcBorders>
+            <w:tcMar>
+              <w:top w:type="dxa" w:w="90"/>
+              <w:left w:type="dxa" w:w="110"/>
+              <w:bottom w:type="dxa" w:w="90"/>
+              <w:right w:type="dxa" w:w="110"/>
+            </w:tcMar>
+            <w:vAlign w:val="center"/>
+          </w:tcPr>
+          <w:p>
+            <w:pPr>
+              <w:jc w:val="left"/>
+            </w:pPr>
+            <w:r>
+              <w:rPr>
+                <w:b w:val="false"/>
+                <w:bCs w:val="false"/>
+                <w:sz w:val="19"/>
+                <w:szCs w:val="19"/>
+              </w:rPr>
+              <w:t xml:space="preserve">✅</w:t>
             </w:r>
           </w:p>
         </w:tc>

</xml_diff>